<commit_message>
Update preprocessing script and data methodology report
</commit_message>
<xml_diff>
--- a/paper/drafts/02_data_methodology.docx
+++ b/paper/drafts/02_data_methodology.docx
@@ -30,7 +30,7 @@
           <w:color w:val="000000"/>
           <w:sz w:val="26"/>
         </w:rPr>
-        <w:t>Global Financial Conditions and Cryptocurrency Markets: Nonlinear Transmission of Monetary, Dollar and Risk Shocks to Bitcoin and Ethereum</w:t>
+        <w:t>Global Financial Conditions and Cryptocurrency Markets: Dynamic and Regime-Dependent Transmission of Interest Rate, Dollar, and Risk Movements to Bitcoin and Ethereum</w:t>
       </w:r>
     </w:p>
     <w:p>
@@ -2521,7 +2521,7 @@
           <w:color w:val="000000"/>
           <w:sz w:val="26"/>
         </w:rPr>
-        <w:t>Bảng thống kê mô tả được lấy từ outputs/tables/descriptive_stats.csv và trình bày với tối đa ba chữ số thập phân để dễ đọc. Số quan sát hợp lệ thay đổi theo biến do lịch công bố và giao dịch khác nhau.</w:t>
+        <w:t>Bảng thống kê mô tả các biến chính trong giai đoạn 2018–2025. N là số quan sát hợp lệ; Mean là giá trị trung bình; Std. Dev. là độ lệch chuẩn; Median là trung vị. Missing (%) thể hiện tỷ lệ dữ liệu thiếu.</w:t>
       </w:r>
     </w:p>
     <w:tbl>
@@ -2559,7 +2559,7 @@
                 <w:color w:val="000000"/>
                 <w:sz w:val="26"/>
               </w:rPr>
-              <w:t>Unnamed: 0</w:t>
+              <w:t>Biến</w:t>
             </w:r>
           </w:p>
         </w:tc>
@@ -2579,7 +2579,7 @@
                 <w:color w:val="000000"/>
                 <w:sz w:val="26"/>
               </w:rPr>
-              <w:t>count</w:t>
+              <w:t>N</w:t>
             </w:r>
           </w:p>
         </w:tc>
@@ -2599,7 +2599,7 @@
                 <w:color w:val="000000"/>
                 <w:sz w:val="26"/>
               </w:rPr>
-              <w:t>mean</w:t>
+              <w:t>Mean</w:t>
             </w:r>
           </w:p>
         </w:tc>
@@ -2619,7 +2619,7 @@
                 <w:color w:val="000000"/>
                 <w:sz w:val="26"/>
               </w:rPr>
-              <w:t>std</w:t>
+              <w:t>Std. Dev.</w:t>
             </w:r>
           </w:p>
         </w:tc>
@@ -2639,7 +2639,7 @@
                 <w:color w:val="000000"/>
                 <w:sz w:val="26"/>
               </w:rPr>
-              <w:t>min</w:t>
+              <w:t>Min</w:t>
             </w:r>
           </w:p>
         </w:tc>
@@ -2659,7 +2659,7 @@
                 <w:color w:val="000000"/>
                 <w:sz w:val="26"/>
               </w:rPr>
-              <w:t>50%</w:t>
+              <w:t>Median</w:t>
             </w:r>
           </w:p>
         </w:tc>
@@ -2679,7 +2679,7 @@
                 <w:color w:val="000000"/>
                 <w:sz w:val="26"/>
               </w:rPr>
-              <w:t>max</w:t>
+              <w:t>Max</w:t>
             </w:r>
           </w:p>
         </w:tc>
@@ -2699,7 +2699,7 @@
                 <w:color w:val="000000"/>
                 <w:sz w:val="26"/>
               </w:rPr>
-              <w:t>missing_rate_pct</w:t>
+              <w:t>Missing (%)</w:t>
             </w:r>
           </w:p>
         </w:tc>
@@ -4255,6 +4255,32 @@
           <w:color w:val="000000"/>
           <w:sz w:val="26"/>
         </w:rPr>
+        <w:t>Xét các biến giá, BTC và ETH có quy mô giá trung bình khác nhau và mức độ phân tán đáng kể trong giai đoạn nghiên cứu. Do giá tài sản có xu hướng biến động theo thời gian, các thống kê về mức giá được sử dụng chủ yếu để mô tả dữ liệu, không thay thế việc phân tích lợi suất.</w:t>
+      </w:r>
+    </w:p>
+    <w:p>
+      <w:pPr>
+        <w:spacing w:line="360" w:lineRule="auto"/>
+      </w:pPr>
+      <w:r>
+        <w:rPr>
+          <w:rFonts w:ascii="Times New Roman" w:hAnsi="Times New Roman"/>
+          <w:color w:val="000000"/>
+          <w:sz w:val="26"/>
+        </w:rPr>
+        <w:t>Đối với lợi suất log theo ngày, độ lệch chuẩn của ETH cao hơn BTC trong mẫu mô tả, cho thấy lợi suất ETH có mức phân tán lớn hơn trong giai đoạn được khảo sát. Các biến vĩ mô có số quan sát hợp lệ thấp hơn chuỗi giá crypto do lịch giao dịch và công bố không bao phủ toàn bộ ngày lịch. Vì vậy, việc so sánh các biến cần dựa trên mẫu thực tế được sử dụng trong từng phân tích.</w:t>
+      </w:r>
+    </w:p>
+    <w:p>
+      <w:pPr>
+        <w:spacing w:line="360" w:lineRule="auto"/>
+      </w:pPr>
+      <w:r>
+        <w:rPr>
+          <w:rFonts w:ascii="Times New Roman" w:hAnsi="Times New Roman"/>
+          <w:color w:val="000000"/>
+          <w:sz w:val="26"/>
+        </w:rPr>
         <w:t>Ma trận tương quan dùng cùng nhóm biến lợi suất/thay đổi được phân tích ở Chương 3. Hệ số tương quan mô tả quan hệ tuyến tính không điều kiện; tương quan không xác lập quan hệ nhân quả, và cỡ mẫu có thể khác nhau giữa các cặp biến nếu dùng loại bỏ thiếu theo cặp.</w:t>
       </w:r>
     </w:p>
@@ -4291,7 +4317,7 @@
                 <w:color w:val="000000"/>
                 <w:sz w:val="26"/>
               </w:rPr>
-              <w:t>Unnamed: 0</w:t>
+              <w:t>Biến</w:t>
             </w:r>
           </w:p>
         </w:tc>
@@ -4979,6 +5005,32 @@
     </w:tbl>
     <w:p>
       <w:pPr>
+        <w:spacing w:line="360" w:lineRule="auto"/>
+      </w:pPr>
+      <w:r>
+        <w:rPr>
+          <w:rFonts w:ascii="Times New Roman" w:hAnsi="Times New Roman"/>
+          <w:color w:val="000000"/>
+          <w:sz w:val="26"/>
+        </w:rPr>
+        <w:t>Ma trận cho thấy lợi suất BTC và ETH có tương quan dương tương đối cao (0,825), phản ánh mức độ đồng biến trong mẫu. Thay đổi VIX có tương quan âm với lợi suất BTC (-0,326) và ETH (-0,344), trong khi lợi suất DXY có tương quan âm với lợi suất của hai tài sản ở mức thấp hơn. Thay đổi US2Y có tương quan tuyến tính gần bằng không với lợi suất BTC và ETH trong ma trận này.</w:t>
+      </w:r>
+    </w:p>
+    <w:p>
+      <w:pPr>
+        <w:spacing w:line="360" w:lineRule="auto"/>
+      </w:pPr>
+      <w:r>
+        <w:rPr>
+          <w:rFonts w:ascii="Times New Roman" w:hAnsi="Times New Roman"/>
+          <w:color w:val="000000"/>
+          <w:sz w:val="26"/>
+        </w:rPr>
+        <w:t>Đây là các tương quan tuyến tính không điều kiện, không phản ánh đầy đủ quan hệ động, độ trễ hoặc sự khác biệt giữa các trạng thái thị trường. Các kết quả này không đủ để kết luận về quan hệ nhân quả; những vấn đề đó được xem xét riêng trong các mô hình kinh tế lượng ở Chương 3.</w:t>
+      </w:r>
+    </w:p>
+    <w:p>
+      <w:pPr>
         <w:pStyle w:val="Heading1"/>
         <w:spacing w:line="360" w:lineRule="auto"/>
       </w:pPr>
@@ -5029,6 +5081,71 @@
           <w:sz w:val="26"/>
         </w:rPr>
         <w:t>Đối với Chương 4, năm 2025 là tập kiểm tra ngoài mẫu gồm 365 ngày dự báo cho mỗi tài sản; giai đoạn đến hết năm 2024 được dùng để huấn luyện và lựa chọn tham số qua xác thực theo thời gian. Thông tin chuẩn hóa, điền khuyết và các lựa chọn mô hình không được ước lượng từ tập kiểm tra 2025.</w:t>
+      </w:r>
+    </w:p>
+    <w:p>
+      <w:pPr>
+        <w:spacing w:line="360" w:lineRule="auto"/>
+      </w:pPr>
+      <w:r>
+        <w:rPr>
+          <w:rFonts w:ascii="Times New Roman" w:hAnsi="Times New Roman"/>
+          <w:color w:val="000000"/>
+          <w:sz w:val="26"/>
+        </w:rPr>
+        <w:t>Trong bài toán học máy ở Chương 4, biến mục tiêu là độ lớn lợi suất log của ngày kế tiếp, được xác định bằng y_(t+1) = |r_(t+1)|. Biến mục tiêu được đo bằng điểm phần trăm mỗi ngày và không phải thước đo phương sai thực hiện trên một cửa sổ nhiều ngày, VaR hay ES.</w:t>
+      </w:r>
+    </w:p>
+    <w:p>
+      <w:pPr>
+        <w:spacing w:line="360" w:lineRule="auto"/>
+      </w:pPr>
+      <w:r>
+        <w:rPr>
+          <w:rFonts w:ascii="Times New Roman" w:hAnsi="Times New Roman"/>
+          <w:color w:val="000000"/>
+          <w:sz w:val="26"/>
+        </w:rPr>
+        <w:t>Nghiên cứu so sánh hai bộ đặc trưng. Bộ Crypto-only gồm 40 đặc trưng được xây dựng từ thông tin giá và lợi suất crypto, bao gồm các độ trễ của lợi suất, độ lớn lợi suất, thống kê cuộn với cửa sổ 3, 7, 14 và 30 ngày, cùng các đặc trưng chu kỳ thứ trong tuần. Bộ Crypto+Macro bổ sung 12 đặc trưng vĩ mô, gồm mức quan sát gần nhất, thay đổi mới được ghi nhận, cờ quan sát mới và số ngày kể từ lần quan sát trước cho từng chuỗi US2Y, DXY và VIX.</w:t>
+      </w:r>
+    </w:p>
+    <w:p>
+      <w:pPr>
+        <w:spacing w:line="360" w:lineRule="auto"/>
+      </w:pPr>
+      <w:r>
+        <w:rPr>
+          <w:rFonts w:ascii="Times New Roman" w:hAnsi="Times New Roman"/>
+          <w:color w:val="000000"/>
+          <w:sz w:val="26"/>
+        </w:rPr>
+        <w:t>Các mô hình dự báo gồm chuẩn đối chiếu là trung bình độ lớn lợi suất trong 30 ngày gần nhất, Elastic Net và XGBoost. Hai bộ đặc trưng được đánh giá riêng cho BTC và ETH. Dữ liệu được chia theo thời gian: các năm 2022–2024 được sử dụng cho quy trình xác thực và lựa chọn mô hình, sau đó mô hình được huấn luyện bằng dữ liệu đến hết năm 2024 và đánh giá trên 365 ngày của năm 2025. Dữ liệu nhãn năm 2025 không được sử dụng để huấn luyện hoặc lựa chọn mô hình.</w:t>
+      </w:r>
+    </w:p>
+    <w:p>
+      <w:pPr>
+        <w:spacing w:line="360" w:lineRule="auto"/>
+      </w:pPr>
+      <w:r>
+        <w:rPr>
+          <w:rFonts w:ascii="Times New Roman" w:hAnsi="Times New Roman"/>
+          <w:color w:val="000000"/>
+          <w:sz w:val="26"/>
+        </w:rPr>
+        <w:t>Các bước điền khuyết và chuẩn hóa được ước lượng từ dữ liệu huấn luyện rồi áp dụng cho dữ liệu đánh giá. Đối với đặc trưng vĩ mô, thông tin tại ngày t chỉ được sử dụng để dự báo từ ngày t+1 trở đi; cờ quan sát mới và biến thay đổi không được lặp lại giả tạo vào những ngày không có quan sát mới. Hiệu quả dự báo được đánh giá bằng MAE và RMSE. Chênh lệch MAE giữa hai bộ đặc trưng được phân tích thêm bằng bootstrap khối thời gian, với độ dài khối 7 ngày và 2.000 lần lặp.</w:t>
+      </w:r>
+    </w:p>
+    <w:p>
+      <w:pPr>
+        <w:spacing w:line="360" w:lineRule="auto"/>
+      </w:pPr>
+      <w:r>
+        <w:rPr>
+          <w:rFonts w:ascii="Times New Roman" w:hAnsi="Times New Roman"/>
+          <w:color w:val="000000"/>
+          <w:sz w:val="26"/>
+        </w:rPr>
+        <w:t>Đối với Elastic Net, mức độ quan trọng của đặc trưng được xem xét thông qua trị tuyệt đối của hệ số chuẩn hóa; đối với XGBoost, sử dụng thước đo gain. Hai thước đo này khác nhau về bản chất nên không được so sánh trực tiếp về độ lớn.</w:t>
       </w:r>
     </w:p>
     <w:p>

</xml_diff>